<commit_message>
V126 More images in cache , updated Pieceology
</commit_message>
<xml_diff>
--- a/src/files/Pieceology.DOCX
+++ b/src/files/Pieceology.DOCX
@@ -91,6 +91,57 @@
         </w:numPr>
       </w:pPr>
       <w:r>
+        <w:drawing>
+          <wp:anchor distT="0" distB="0" distL="114300" distR="114300" simplePos="0" relativeHeight="251708416" behindDoc="0" locked="0" layoutInCell="1" allowOverlap="1" wp14:anchorId="4FEC1ED5" wp14:editId="1A68E60C">
+            <wp:simplePos x="0" y="0"/>
+            <wp:positionH relativeFrom="column">
+              <wp:posOffset>4129405</wp:posOffset>
+            </wp:positionH>
+            <wp:positionV relativeFrom="paragraph">
+              <wp:posOffset>8890</wp:posOffset>
+            </wp:positionV>
+            <wp:extent cx="1400175" cy="666750"/>
+            <wp:effectExtent l="0" t="0" r="9525" b="0"/>
+            <wp:wrapSquare wrapText="bothSides"/>
+            <wp:docPr id="1273830780" name="Obrázek 1"/>
+            <wp:cNvGraphicFramePr>
+              <a:graphicFrameLocks xmlns:a="http://schemas.openxmlformats.org/drawingml/2006/main" noChangeAspect="1"/>
+            </wp:cNvGraphicFramePr>
+            <a:graphic xmlns:a="http://schemas.openxmlformats.org/drawingml/2006/main">
+              <a:graphicData uri="http://schemas.openxmlformats.org/drawingml/2006/picture">
+                <pic:pic xmlns:pic="http://schemas.openxmlformats.org/drawingml/2006/picture">
+                  <pic:nvPicPr>
+                    <pic:cNvPr id="1273830780" name=""/>
+                    <pic:cNvPicPr/>
+                  </pic:nvPicPr>
+                  <pic:blipFill>
+                    <a:blip r:embed="rId8">
+                      <a:extLst>
+                        <a:ext uri="{28A0092B-C50C-407E-A947-70E740481C1C}">
+                          <a14:useLocalDpi xmlns:a14="http://schemas.microsoft.com/office/drawing/2010/main" val="0"/>
+                        </a:ext>
+                      </a:extLst>
+                    </a:blip>
+                    <a:stretch>
+                      <a:fillRect/>
+                    </a:stretch>
+                  </pic:blipFill>
+                  <pic:spPr>
+                    <a:xfrm>
+                      <a:off x="0" y="0"/>
+                      <a:ext cx="1400175" cy="666750"/>
+                    </a:xfrm>
+                    <a:prstGeom prst="rect">
+                      <a:avLst/>
+                    </a:prstGeom>
+                  </pic:spPr>
+                </pic:pic>
+              </a:graphicData>
+            </a:graphic>
+          </wp:anchor>
+        </w:drawing>
+      </w:r>
+      <w:r>
         <w:t xml:space="preserve">3 </w:t>
       </w:r>
       <w:proofErr w:type="spellStart"/>
@@ -208,6 +259,57 @@
           <w:numId w:val="1"/>
         </w:numPr>
       </w:pPr>
+      <w:r>
+        <w:drawing>
+          <wp:anchor distT="0" distB="0" distL="114300" distR="114300" simplePos="0" relativeHeight="251709440" behindDoc="0" locked="0" layoutInCell="1" allowOverlap="1" wp14:anchorId="34A9B7B1" wp14:editId="3D6097C5">
+            <wp:simplePos x="0" y="0"/>
+            <wp:positionH relativeFrom="column">
+              <wp:posOffset>4157980</wp:posOffset>
+            </wp:positionH>
+            <wp:positionV relativeFrom="paragraph">
+              <wp:posOffset>153035</wp:posOffset>
+            </wp:positionV>
+            <wp:extent cx="1371600" cy="666750"/>
+            <wp:effectExtent l="0" t="0" r="0" b="0"/>
+            <wp:wrapSquare wrapText="bothSides"/>
+            <wp:docPr id="1299782482" name="Obrázek 1"/>
+            <wp:cNvGraphicFramePr>
+              <a:graphicFrameLocks xmlns:a="http://schemas.openxmlformats.org/drawingml/2006/main" noChangeAspect="1"/>
+            </wp:cNvGraphicFramePr>
+            <a:graphic xmlns:a="http://schemas.openxmlformats.org/drawingml/2006/main">
+              <a:graphicData uri="http://schemas.openxmlformats.org/drawingml/2006/picture">
+                <pic:pic xmlns:pic="http://schemas.openxmlformats.org/drawingml/2006/picture">
+                  <pic:nvPicPr>
+                    <pic:cNvPr id="1299782482" name=""/>
+                    <pic:cNvPicPr/>
+                  </pic:nvPicPr>
+                  <pic:blipFill>
+                    <a:blip r:embed="rId9">
+                      <a:extLst>
+                        <a:ext uri="{28A0092B-C50C-407E-A947-70E740481C1C}">
+                          <a14:useLocalDpi xmlns:a14="http://schemas.microsoft.com/office/drawing/2010/main" val="0"/>
+                        </a:ext>
+                      </a:extLst>
+                    </a:blip>
+                    <a:stretch>
+                      <a:fillRect/>
+                    </a:stretch>
+                  </pic:blipFill>
+                  <pic:spPr>
+                    <a:xfrm>
+                      <a:off x="0" y="0"/>
+                      <a:ext cx="1371600" cy="666750"/>
+                    </a:xfrm>
+                    <a:prstGeom prst="rect">
+                      <a:avLst/>
+                    </a:prstGeom>
+                  </pic:spPr>
+                </pic:pic>
+              </a:graphicData>
+            </a:graphic>
+          </wp:anchor>
+        </w:drawing>
+      </w:r>
       <w:proofErr w:type="spellStart"/>
       <w:r>
         <w:t>castle</w:t>
@@ -283,6 +385,57 @@
           <w:numId w:val="1"/>
         </w:numPr>
       </w:pPr>
+      <w:r>
+        <w:drawing>
+          <wp:anchor distT="0" distB="0" distL="114300" distR="114300" simplePos="0" relativeHeight="251707392" behindDoc="0" locked="0" layoutInCell="1" allowOverlap="1" wp14:anchorId="4176CD0A" wp14:editId="756C7FBB">
+            <wp:simplePos x="0" y="0"/>
+            <wp:positionH relativeFrom="column">
+              <wp:posOffset>4148455</wp:posOffset>
+            </wp:positionH>
+            <wp:positionV relativeFrom="paragraph">
+              <wp:posOffset>74930</wp:posOffset>
+            </wp:positionV>
+            <wp:extent cx="1390650" cy="666750"/>
+            <wp:effectExtent l="0" t="0" r="0" b="0"/>
+            <wp:wrapSquare wrapText="bothSides"/>
+            <wp:docPr id="1901131795" name="Obrázek 1"/>
+            <wp:cNvGraphicFramePr>
+              <a:graphicFrameLocks xmlns:a="http://schemas.openxmlformats.org/drawingml/2006/main" noChangeAspect="1"/>
+            </wp:cNvGraphicFramePr>
+            <a:graphic xmlns:a="http://schemas.openxmlformats.org/drawingml/2006/main">
+              <a:graphicData uri="http://schemas.openxmlformats.org/drawingml/2006/picture">
+                <pic:pic xmlns:pic="http://schemas.openxmlformats.org/drawingml/2006/picture">
+                  <pic:nvPicPr>
+                    <pic:cNvPr id="1901131795" name=""/>
+                    <pic:cNvPicPr/>
+                  </pic:nvPicPr>
+                  <pic:blipFill>
+                    <a:blip r:embed="rId10">
+                      <a:extLst>
+                        <a:ext uri="{28A0092B-C50C-407E-A947-70E740481C1C}">
+                          <a14:useLocalDpi xmlns:a14="http://schemas.microsoft.com/office/drawing/2010/main" val="0"/>
+                        </a:ext>
+                      </a:extLst>
+                    </a:blip>
+                    <a:stretch>
+                      <a:fillRect/>
+                    </a:stretch>
+                  </pic:blipFill>
+                  <pic:spPr>
+                    <a:xfrm>
+                      <a:off x="0" y="0"/>
+                      <a:ext cx="1390650" cy="666750"/>
+                    </a:xfrm>
+                    <a:prstGeom prst="rect">
+                      <a:avLst/>
+                    </a:prstGeom>
+                  </pic:spPr>
+                </pic:pic>
+              </a:graphicData>
+            </a:graphic>
+          </wp:anchor>
+        </w:drawing>
+      </w:r>
       <w:proofErr w:type="spellStart"/>
       <w:r>
         <w:t>white</w:t>
@@ -595,7 +748,7 @@
                     <pic:cNvPicPr/>
                   </pic:nvPicPr>
                   <pic:blipFill>
-                    <a:blip r:embed="rId8">
+                    <a:blip r:embed="rId11">
                       <a:extLst>
                         <a:ext uri="{28A0092B-C50C-407E-A947-70E740481C1C}">
                           <a14:useLocalDpi xmlns:a14="http://schemas.microsoft.com/office/drawing/2010/main" val="0"/>
@@ -1073,7 +1226,7 @@
                     </pic:cNvPicPr>
                   </pic:nvPicPr>
                   <pic:blipFill>
-                    <a:blip r:embed="rId9" cstate="print">
+                    <a:blip r:embed="rId12" cstate="print">
                       <a:extLst>
                         <a:ext uri="{28A0092B-C50C-407E-A947-70E740481C1C}">
                           <a14:useLocalDpi xmlns:a14="http://schemas.microsoft.com/office/drawing/2010/main" val="0"/>
@@ -1168,7 +1321,7 @@
                     </pic:cNvPicPr>
                   </pic:nvPicPr>
                   <pic:blipFill>
-                    <a:blip r:embed="rId10" cstate="print">
+                    <a:blip r:embed="rId13" cstate="print">
                       <a:extLst>
                         <a:ext uri="{28A0092B-C50C-407E-A947-70E740481C1C}">
                           <a14:useLocalDpi xmlns:a14="http://schemas.microsoft.com/office/drawing/2010/main" val="0"/>
@@ -1237,7 +1390,7 @@
                     </pic:cNvPicPr>
                   </pic:nvPicPr>
                   <pic:blipFill>
-                    <a:blip r:embed="rId11" cstate="print">
+                    <a:blip r:embed="rId14" cstate="print">
                       <a:extLst>
                         <a:ext uri="{28A0092B-C50C-407E-A947-70E740481C1C}">
                           <a14:useLocalDpi xmlns:a14="http://schemas.microsoft.com/office/drawing/2010/main" val="0"/>
@@ -1352,7 +1505,7 @@
                     </pic:cNvPicPr>
                   </pic:nvPicPr>
                   <pic:blipFill>
-                    <a:blip r:embed="rId12" cstate="print">
+                    <a:blip r:embed="rId15" cstate="print">
                       <a:extLst>
                         <a:ext uri="{28A0092B-C50C-407E-A947-70E740481C1C}">
                           <a14:useLocalDpi xmlns:a14="http://schemas.microsoft.com/office/drawing/2010/main" val="0"/>
@@ -1438,7 +1591,7 @@
                     </pic:cNvPicPr>
                   </pic:nvPicPr>
                   <pic:blipFill>
-                    <a:blip r:embed="rId13" cstate="print">
+                    <a:blip r:embed="rId16" cstate="print">
                       <a:extLst>
                         <a:ext uri="{28A0092B-C50C-407E-A947-70E740481C1C}">
                           <a14:useLocalDpi xmlns:a14="http://schemas.microsoft.com/office/drawing/2010/main" val="0"/>
@@ -1524,7 +1677,7 @@
                     </pic:cNvPicPr>
                   </pic:nvPicPr>
                   <pic:blipFill>
-                    <a:blip r:embed="rId14" cstate="print">
+                    <a:blip r:embed="rId17" cstate="print">
                       <a:extLst>
                         <a:ext uri="{28A0092B-C50C-407E-A947-70E740481C1C}">
                           <a14:useLocalDpi xmlns:a14="http://schemas.microsoft.com/office/drawing/2010/main" val="0"/>
@@ -1591,7 +1744,7 @@
                     </pic:cNvPicPr>
                   </pic:nvPicPr>
                   <pic:blipFill>
-                    <a:blip r:embed="rId15" cstate="print">
+                    <a:blip r:embed="rId18" cstate="print">
                       <a:extLst>
                         <a:ext uri="{28A0092B-C50C-407E-A947-70E740481C1C}">
                           <a14:useLocalDpi xmlns:a14="http://schemas.microsoft.com/office/drawing/2010/main" val="0"/>
@@ -1658,7 +1811,7 @@
                     </pic:cNvPicPr>
                   </pic:nvPicPr>
                   <pic:blipFill>
-                    <a:blip r:embed="rId16" cstate="print">
+                    <a:blip r:embed="rId19" cstate="print">
                       <a:extLst>
                         <a:ext uri="{28A0092B-C50C-407E-A947-70E740481C1C}">
                           <a14:useLocalDpi xmlns:a14="http://schemas.microsoft.com/office/drawing/2010/main" val="0"/>
@@ -1849,7 +2002,7 @@
                     </pic:cNvPicPr>
                   </pic:nvPicPr>
                   <pic:blipFill>
-                    <a:blip r:embed="rId17" cstate="print">
+                    <a:blip r:embed="rId20" cstate="print">
                       <a:extLst>
                         <a:ext uri="{28A0092B-C50C-407E-A947-70E740481C1C}">
                           <a14:useLocalDpi xmlns:a14="http://schemas.microsoft.com/office/drawing/2010/main" val="0"/>
@@ -1916,7 +2069,7 @@
                     </pic:cNvPicPr>
                   </pic:nvPicPr>
                   <pic:blipFill>
-                    <a:blip r:embed="rId18" cstate="print">
+                    <a:blip r:embed="rId21" cstate="print">
                       <a:extLst>
                         <a:ext uri="{28A0092B-C50C-407E-A947-70E740481C1C}">
                           <a14:useLocalDpi xmlns:a14="http://schemas.microsoft.com/office/drawing/2010/main" val="0"/>
@@ -1988,7 +2141,7 @@
                     </pic:cNvPicPr>
                   </pic:nvPicPr>
                   <pic:blipFill>
-                    <a:blip r:embed="rId19" cstate="print">
+                    <a:blip r:embed="rId22" cstate="print">
                       <a:extLst>
                         <a:ext uri="{28A0092B-C50C-407E-A947-70E740481C1C}">
                           <a14:useLocalDpi xmlns:a14="http://schemas.microsoft.com/office/drawing/2010/main" val="0"/>
@@ -2060,7 +2213,7 @@
                     </pic:cNvPicPr>
                   </pic:nvPicPr>
                   <pic:blipFill>
-                    <a:blip r:embed="rId20" cstate="print">
+                    <a:blip r:embed="rId23" cstate="print">
                       <a:extLst>
                         <a:ext uri="{28A0092B-C50C-407E-A947-70E740481C1C}">
                           <a14:useLocalDpi xmlns:a14="http://schemas.microsoft.com/office/drawing/2010/main" val="0"/>
@@ -2145,7 +2298,7 @@
                     </pic:cNvPicPr>
                   </pic:nvPicPr>
                   <pic:blipFill>
-                    <a:blip r:embed="rId21" cstate="print">
+                    <a:blip r:embed="rId24" cstate="print">
                       <a:extLst>
                         <a:ext uri="{28A0092B-C50C-407E-A947-70E740481C1C}">
                           <a14:useLocalDpi xmlns:a14="http://schemas.microsoft.com/office/drawing/2010/main" val="0"/>
@@ -2277,7 +2430,7 @@
                     </pic:cNvPicPr>
                   </pic:nvPicPr>
                   <pic:blipFill>
-                    <a:blip r:embed="rId22" cstate="print">
+                    <a:blip r:embed="rId25" cstate="print">
                       <a:extLst>
                         <a:ext uri="{28A0092B-C50C-407E-A947-70E740481C1C}">
                           <a14:useLocalDpi xmlns:a14="http://schemas.microsoft.com/office/drawing/2010/main" val="0"/>
@@ -2347,7 +2500,7 @@
                     <pic:cNvPicPr/>
                   </pic:nvPicPr>
                   <pic:blipFill>
-                    <a:blip r:embed="rId23">
+                    <a:blip r:embed="rId26">
                       <a:extLst>
                         <a:ext uri="{28A0092B-C50C-407E-A947-70E740481C1C}">
                           <a14:useLocalDpi xmlns:a14="http://schemas.microsoft.com/office/drawing/2010/main" val="0"/>
@@ -2411,7 +2564,7 @@
                     <pic:cNvPicPr/>
                   </pic:nvPicPr>
                   <pic:blipFill>
-                    <a:blip r:embed="rId24">
+                    <a:blip r:embed="rId27">
                       <a:extLst>
                         <a:ext uri="{28A0092B-C50C-407E-A947-70E740481C1C}">
                           <a14:useLocalDpi xmlns:a14="http://schemas.microsoft.com/office/drawing/2010/main" val="0"/>
@@ -2834,7 +2987,7 @@
                     <pic:cNvPicPr/>
                   </pic:nvPicPr>
                   <pic:blipFill>
-                    <a:blip r:embed="rId25">
+                    <a:blip r:embed="rId28">
                       <a:extLst>
                         <a:ext uri="{28A0092B-C50C-407E-A947-70E740481C1C}">
                           <a14:useLocalDpi xmlns:a14="http://schemas.microsoft.com/office/drawing/2010/main" val="0"/>
@@ -2896,7 +3049,7 @@
                     <pic:cNvPicPr/>
                   </pic:nvPicPr>
                   <pic:blipFill>
-                    <a:blip r:embed="rId26">
+                    <a:blip r:embed="rId29">
                       <a:extLst>
                         <a:ext uri="{28A0092B-C50C-407E-A947-70E740481C1C}">
                           <a14:useLocalDpi xmlns:a14="http://schemas.microsoft.com/office/drawing/2010/main" val="0"/>
@@ -2950,7 +3103,7 @@
                     <pic:cNvPicPr/>
                   </pic:nvPicPr>
                   <pic:blipFill>
-                    <a:blip r:embed="rId27">
+                    <a:blip r:embed="rId30">
                       <a:extLst>
                         <a:ext uri="{28A0092B-C50C-407E-A947-70E740481C1C}">
                           <a14:useLocalDpi xmlns:a14="http://schemas.microsoft.com/office/drawing/2010/main" val="0"/>
@@ -3004,7 +3157,7 @@
                     <pic:cNvPicPr/>
                   </pic:nvPicPr>
                   <pic:blipFill>
-                    <a:blip r:embed="rId28">
+                    <a:blip r:embed="rId31">
                       <a:extLst>
                         <a:ext uri="{28A0092B-C50C-407E-A947-70E740481C1C}">
                           <a14:useLocalDpi xmlns:a14="http://schemas.microsoft.com/office/drawing/2010/main" val="0"/>
@@ -3075,7 +3228,7 @@
                     </pic:cNvPicPr>
                   </pic:nvPicPr>
                   <pic:blipFill>
-                    <a:blip r:embed="rId29" cstate="print">
+                    <a:blip r:embed="rId32" cstate="print">
                       <a:extLst>
                         <a:ext uri="{28A0092B-C50C-407E-A947-70E740481C1C}">
                           <a14:useLocalDpi xmlns:a14="http://schemas.microsoft.com/office/drawing/2010/main" val="0"/>
@@ -3270,7 +3423,7 @@
                     </pic:cNvPicPr>
                   </pic:nvPicPr>
                   <pic:blipFill>
-                    <a:blip r:embed="rId30" cstate="print">
+                    <a:blip r:embed="rId33" cstate="print">
                       <a:extLst>
                         <a:ext uri="{28A0092B-C50C-407E-A947-70E740481C1C}">
                           <a14:useLocalDpi xmlns:a14="http://schemas.microsoft.com/office/drawing/2010/main" val="0"/>
@@ -3406,7 +3559,7 @@
                     <pic:cNvPicPr/>
                   </pic:nvPicPr>
                   <pic:blipFill>
-                    <a:blip r:embed="rId31">
+                    <a:blip r:embed="rId34">
                       <a:extLst>
                         <a:ext uri="{28A0092B-C50C-407E-A947-70E740481C1C}">
                           <a14:useLocalDpi xmlns:a14="http://schemas.microsoft.com/office/drawing/2010/main" val="0"/>
@@ -3464,7 +3617,7 @@
                     </pic:cNvPicPr>
                   </pic:nvPicPr>
                   <pic:blipFill>
-                    <a:blip r:embed="rId32" cstate="print">
+                    <a:blip r:embed="rId35" cstate="print">
                       <a:extLst>
                         <a:ext uri="{28A0092B-C50C-407E-A947-70E740481C1C}">
                           <a14:useLocalDpi xmlns:a14="http://schemas.microsoft.com/office/drawing/2010/main" val="0"/>
@@ -3529,7 +3682,7 @@
                     <pic:cNvPicPr/>
                   </pic:nvPicPr>
                   <pic:blipFill>
-                    <a:blip r:embed="rId33">
+                    <a:blip r:embed="rId36">
                       <a:extLst>
                         <a:ext uri="{28A0092B-C50C-407E-A947-70E740481C1C}">
                           <a14:useLocalDpi xmlns:a14="http://schemas.microsoft.com/office/drawing/2010/main" val="0"/>
@@ -3655,7 +3808,7 @@
                     <pic:cNvPicPr/>
                   </pic:nvPicPr>
                   <pic:blipFill>
-                    <a:blip r:embed="rId34">
+                    <a:blip r:embed="rId37">
                       <a:extLst>
                         <a:ext uri="{28A0092B-C50C-407E-A947-70E740481C1C}">
                           <a14:useLocalDpi xmlns:a14="http://schemas.microsoft.com/office/drawing/2010/main" val="0"/>
@@ -3715,7 +3868,7 @@
                     <pic:cNvPicPr/>
                   </pic:nvPicPr>
                   <pic:blipFill>
-                    <a:blip r:embed="rId35">
+                    <a:blip r:embed="rId38">
                       <a:extLst>
                         <a:ext uri="{28A0092B-C50C-407E-A947-70E740481C1C}">
                           <a14:useLocalDpi xmlns:a14="http://schemas.microsoft.com/office/drawing/2010/main" val="0"/>
@@ -4131,7 +4284,7 @@
                     </pic:cNvPicPr>
                   </pic:nvPicPr>
                   <pic:blipFill>
-                    <a:blip r:embed="rId36" cstate="print">
+                    <a:blip r:embed="rId39" cstate="print">
                       <a:extLst>
                         <a:ext uri="{28A0092B-C50C-407E-A947-70E740481C1C}">
                           <a14:useLocalDpi xmlns:a14="http://schemas.microsoft.com/office/drawing/2010/main" val="0"/>
@@ -4486,7 +4639,7 @@
                     <pic:cNvPicPr/>
                   </pic:nvPicPr>
                   <pic:blipFill>
-                    <a:blip r:embed="rId37">
+                    <a:blip r:embed="rId40">
                       <a:extLst>
                         <a:ext uri="{28A0092B-C50C-407E-A947-70E740481C1C}">
                           <a14:useLocalDpi xmlns:a14="http://schemas.microsoft.com/office/drawing/2010/main" val="0"/>
@@ -4546,7 +4699,7 @@
                     <pic:cNvPicPr/>
                   </pic:nvPicPr>
                   <pic:blipFill>
-                    <a:blip r:embed="rId38">
+                    <a:blip r:embed="rId41">
                       <a:extLst>
                         <a:ext uri="{28A0092B-C50C-407E-A947-70E740481C1C}">
                           <a14:useLocalDpi xmlns:a14="http://schemas.microsoft.com/office/drawing/2010/main" val="0"/>
@@ -4599,6 +4752,34 @@
       <w:bookmarkEnd w:id="43"/>
       <w:bookmarkEnd w:id="44"/>
       <w:proofErr w:type="spellEnd"/>
+    </w:p>
+    <w:p>
+      <w:proofErr w:type="spellStart"/>
+      <w:r>
+        <w:t>Value</w:t>
+      </w:r>
+      <w:proofErr w:type="spellEnd"/>
+      <w:r>
+        <w:t xml:space="preserve"> </w:t>
+      </w:r>
+      <w:proofErr w:type="spellStart"/>
+      <w:r>
+        <w:t>should</w:t>
+      </w:r>
+      <w:proofErr w:type="spellEnd"/>
+      <w:r>
+        <w:t xml:space="preserve"> </w:t>
+      </w:r>
+      <w:proofErr w:type="spellStart"/>
+      <w:proofErr w:type="gramStart"/>
+      <w:r>
+        <w:t>change</w:t>
+      </w:r>
+      <w:proofErr w:type="spellEnd"/>
+      <w:r>
+        <w:t xml:space="preserve"> .</w:t>
+      </w:r>
+      <w:proofErr w:type="gramEnd"/>
     </w:p>
     <w:p>
       <w:pPr>
@@ -4647,7 +4828,7 @@
                     </pic:cNvPicPr>
                   </pic:nvPicPr>
                   <pic:blipFill>
-                    <a:blip r:embed="rId39" cstate="print">
+                    <a:blip r:embed="rId42" cstate="print">
                       <a:extLst>
                         <a:ext uri="{28A0092B-C50C-407E-A947-70E740481C1C}">
                           <a14:useLocalDpi xmlns:a14="http://schemas.microsoft.com/office/drawing/2010/main" val="0"/>
@@ -4793,7 +4974,7 @@
           <w:noProof/>
         </w:rPr>
         <w:drawing>
-          <wp:anchor distT="0" distB="0" distL="114300" distR="114300" simplePos="0" relativeHeight="251693056" behindDoc="0" locked="0" layoutInCell="1" allowOverlap="1" wp14:anchorId="1F089F9A" wp14:editId="60B552D6">
+          <wp:anchor distT="0" distB="0" distL="114300" distR="114300" simplePos="0" relativeHeight="251693056" behindDoc="0" locked="0" layoutInCell="1" allowOverlap="1" wp14:anchorId="1F089F9A" wp14:editId="5D9B263E">
             <wp:simplePos x="0" y="0"/>
             <wp:positionH relativeFrom="margin">
               <wp:align>right</wp:align>
@@ -4818,7 +4999,7 @@
                     </pic:cNvPicPr>
                   </pic:nvPicPr>
                   <pic:blipFill>
-                    <a:blip r:embed="rId40" cstate="print">
+                    <a:blip r:embed="rId43" cstate="print">
                       <a:extLst>
                         <a:ext uri="{28A0092B-C50C-407E-A947-70E740481C1C}">
                           <a14:useLocalDpi xmlns:a14="http://schemas.microsoft.com/office/drawing/2010/main" val="0"/>
@@ -4906,7 +5087,7 @@
                     </pic:cNvPicPr>
                   </pic:nvPicPr>
                   <pic:blipFill>
-                    <a:blip r:embed="rId41" cstate="print">
+                    <a:blip r:embed="rId44" cstate="print">
                       <a:extLst>
                         <a:ext uri="{28A0092B-C50C-407E-A947-70E740481C1C}">
                           <a14:useLocalDpi xmlns:a14="http://schemas.microsoft.com/office/drawing/2010/main" val="0"/>
@@ -4978,13 +5159,7 @@
       </w:r>
       <w:proofErr w:type="gramEnd"/>
       <w:r>
-        <w:t xml:space="preserve"> </w:t>
-      </w:r>
-      <w:r>
-        <w:t>8</w:t>
-      </w:r>
-      <w:r>
-        <w:t xml:space="preserve"> </w:t>
+        <w:t xml:space="preserve"> 8 </w:t>
       </w:r>
       <w:r>
         <w:rPr>
@@ -5016,7 +5191,7 @@
                     </pic:cNvPicPr>
                   </pic:nvPicPr>
                   <pic:blipFill>
-                    <a:blip r:embed="rId42" cstate="print">
+                    <a:blip r:embed="rId45" cstate="print">
                       <a:extLst>
                         <a:ext uri="{28A0092B-C50C-407E-A947-70E740481C1C}">
                           <a14:useLocalDpi xmlns:a14="http://schemas.microsoft.com/office/drawing/2010/main" val="0"/>
@@ -5111,7 +5286,7 @@
           <w:noProof/>
         </w:rPr>
         <w:drawing>
-          <wp:anchor distT="0" distB="0" distL="114300" distR="114300" simplePos="0" relativeHeight="251696128" behindDoc="0" locked="0" layoutInCell="1" allowOverlap="1" wp14:anchorId="4D133924" wp14:editId="2AD5A205">
+          <wp:anchor distT="0" distB="0" distL="114300" distR="114300" simplePos="0" relativeHeight="251696128" behindDoc="0" locked="0" layoutInCell="1" allowOverlap="1" wp14:anchorId="4D133924" wp14:editId="454E0824">
             <wp:simplePos x="0" y="0"/>
             <wp:positionH relativeFrom="margin">
               <wp:posOffset>-304800</wp:posOffset>
@@ -5136,7 +5311,7 @@
                     </pic:cNvPicPr>
                   </pic:nvPicPr>
                   <pic:blipFill>
-                    <a:blip r:embed="rId43" cstate="print">
+                    <a:blip r:embed="rId46" cstate="print">
                       <a:extLst>
                         <a:ext uri="{28A0092B-C50C-407E-A947-70E740481C1C}">
                           <a14:useLocalDpi xmlns:a14="http://schemas.microsoft.com/office/drawing/2010/main" val="0"/>
@@ -5225,7 +5400,7 @@
                     </pic:cNvPicPr>
                   </pic:nvPicPr>
                   <pic:blipFill>
-                    <a:blip r:embed="rId44" cstate="print">
+                    <a:blip r:embed="rId47" cstate="print">
                       <a:extLst>
                         <a:ext uri="{28A0092B-C50C-407E-A947-70E740481C1C}">
                           <a14:useLocalDpi xmlns:a14="http://schemas.microsoft.com/office/drawing/2010/main" val="0"/>
@@ -5303,13 +5478,7 @@
       </w:r>
       <w:proofErr w:type="gramEnd"/>
       <w:r>
-        <w:t xml:space="preserve"> </w:t>
-      </w:r>
-      <w:r>
-        <w:t>4.5</w:t>
-      </w:r>
-      <w:r>
-        <w:t xml:space="preserve"> </w:t>
+        <w:t xml:space="preserve"> 4.5 </w:t>
       </w:r>
       <w:r>
         <w:rPr>
@@ -5345,7 +5514,7 @@
                     </pic:cNvPicPr>
                   </pic:nvPicPr>
                   <pic:blipFill>
-                    <a:blip r:embed="rId45" cstate="print">
+                    <a:blip r:embed="rId48" cstate="print">
                       <a:extLst>
                         <a:ext uri="{28A0092B-C50C-407E-A947-70E740481C1C}">
                           <a14:useLocalDpi xmlns:a14="http://schemas.microsoft.com/office/drawing/2010/main" val="0"/>
@@ -5444,13 +5613,7 @@
       </w:r>
       <w:proofErr w:type="gramEnd"/>
       <w:r>
-        <w:t xml:space="preserve"> </w:t>
-      </w:r>
-      <w:r>
-        <w:t>6</w:t>
-      </w:r>
-      <w:r>
-        <w:t xml:space="preserve"> </w:t>
+        <w:t xml:space="preserve"> 6 </w:t>
       </w:r>
       <w:r>
         <w:rPr>
@@ -5482,7 +5645,7 @@
                     </pic:cNvPicPr>
                   </pic:nvPicPr>
                   <pic:blipFill>
-                    <a:blip r:embed="rId46" cstate="print">
+                    <a:blip r:embed="rId49" cstate="print">
                       <a:extLst>
                         <a:ext uri="{28A0092B-C50C-407E-A947-70E740481C1C}">
                           <a14:useLocalDpi xmlns:a14="http://schemas.microsoft.com/office/drawing/2010/main" val="0"/>
@@ -5522,11 +5685,6 @@
     </w:p>
     <w:p>
       <w:pPr>
-        <w:pStyle w:val="Nadpis3"/>
-      </w:pPr>
-    </w:p>
-    <w:p>
-      <w:pPr>
         <w:rPr>
           <w:rFonts w:eastAsiaTheme="majorEastAsia" w:cstheme="majorBidi"/>
           <w:color w:val="0F4761" w:themeColor="accent1" w:themeShade="BF"/>
@@ -5598,7 +5756,7 @@
                     </pic:cNvPicPr>
                   </pic:nvPicPr>
                   <pic:blipFill>
-                    <a:blip r:embed="rId47" cstate="print">
+                    <a:blip r:embed="rId50" cstate="print">
                       <a:extLst>
                         <a:ext uri="{28A0092B-C50C-407E-A947-70E740481C1C}">
                           <a14:useLocalDpi xmlns:a14="http://schemas.microsoft.com/office/drawing/2010/main" val="0"/>
@@ -5695,7 +5853,7 @@
                     </pic:cNvPicPr>
                   </pic:nvPicPr>
                   <pic:blipFill>
-                    <a:blip r:embed="rId48" cstate="print">
+                    <a:blip r:embed="rId51" cstate="print">
                       <a:extLst>
                         <a:ext uri="{28A0092B-C50C-407E-A947-70E740481C1C}">
                           <a14:useLocalDpi xmlns:a14="http://schemas.microsoft.com/office/drawing/2010/main" val="0"/>
@@ -5833,7 +5991,7 @@
                     </pic:cNvPicPr>
                   </pic:nvPicPr>
                   <pic:blipFill>
-                    <a:blip r:embed="rId49" cstate="print">
+                    <a:blip r:embed="rId52" cstate="print">
                       <a:extLst>
                         <a:ext uri="{28A0092B-C50C-407E-A947-70E740481C1C}">
                           <a14:useLocalDpi xmlns:a14="http://schemas.microsoft.com/office/drawing/2010/main" val="0"/>
@@ -5917,7 +6075,7 @@
                     </pic:cNvPicPr>
                   </pic:nvPicPr>
                   <pic:blipFill>
-                    <a:blip r:embed="rId50" cstate="print">
+                    <a:blip r:embed="rId53" cstate="print">
                       <a:extLst>
                         <a:ext uri="{28A0092B-C50C-407E-A947-70E740481C1C}">
                           <a14:useLocalDpi xmlns:a14="http://schemas.microsoft.com/office/drawing/2010/main" val="0"/>
@@ -5965,10 +6123,7 @@
       </w:r>
       <w:proofErr w:type="gramEnd"/>
       <w:r>
-        <w:t xml:space="preserve"> </w:t>
-      </w:r>
-      <w:r>
-        <w:t>5</w:t>
+        <w:t xml:space="preserve"> 5</w:t>
       </w:r>
     </w:p>
     <w:p>
@@ -6033,7 +6188,7 @@
                     </pic:cNvPicPr>
                   </pic:nvPicPr>
                   <pic:blipFill>
-                    <a:blip r:embed="rId51" cstate="print">
+                    <a:blip r:embed="rId54" cstate="print">
                       <a:extLst>
                         <a:ext uri="{28A0092B-C50C-407E-A947-70E740481C1C}">
                           <a14:useLocalDpi xmlns:a14="http://schemas.microsoft.com/office/drawing/2010/main" val="0"/>
@@ -6127,7 +6282,7 @@
           <w:noProof/>
         </w:rPr>
         <w:drawing>
-          <wp:anchor distT="0" distB="0" distL="114300" distR="114300" simplePos="0" relativeHeight="251706368" behindDoc="0" locked="0" layoutInCell="1" allowOverlap="1" wp14:anchorId="10E07082" wp14:editId="67FFE663">
+          <wp:anchor distT="0" distB="0" distL="114300" distR="114300" simplePos="0" relativeHeight="251706368" behindDoc="0" locked="0" layoutInCell="1" allowOverlap="1" wp14:anchorId="10E07082" wp14:editId="63A468B9">
             <wp:simplePos x="0" y="0"/>
             <wp:positionH relativeFrom="margin">
               <wp:posOffset>2688590</wp:posOffset>
@@ -6152,7 +6307,7 @@
                     </pic:cNvPicPr>
                   </pic:nvPicPr>
                   <pic:blipFill>
-                    <a:blip r:embed="rId52" cstate="print">
+                    <a:blip r:embed="rId55" cstate="print">
                       <a:extLst>
                         <a:ext uri="{28A0092B-C50C-407E-A947-70E740481C1C}">
                           <a14:useLocalDpi xmlns:a14="http://schemas.microsoft.com/office/drawing/2010/main" val="0"/>
@@ -6200,18 +6355,402 @@
       </w:r>
       <w:proofErr w:type="gramEnd"/>
       <w:r>
-        <w:t xml:space="preserve"> </w:t>
-      </w:r>
-      <w:r>
-        <w:t>3.2</w:t>
-      </w:r>
-    </w:p>
-    <w:p/>
-    <w:p/>
-    <w:p/>
-    <w:p/>
-    <w:p/>
-    <w:p/>
+        <w:t xml:space="preserve"> 3.2</w:t>
+      </w:r>
+    </w:p>
+    <w:p>
+      <w:pPr>
+        <w:pStyle w:val="Nadpis3"/>
+      </w:pPr>
+      <w:proofErr w:type="spellStart"/>
+      <w:r>
+        <w:t>Empress</w:t>
+      </w:r>
+      <w:proofErr w:type="spellEnd"/>
+      <w:r>
+        <w:t xml:space="preserve"> </w:t>
+      </w:r>
+    </w:p>
+    <w:p>
+      <w:r>
+        <w:rPr>
+          <w:noProof/>
+        </w:rPr>
+        <w:drawing>
+          <wp:anchor distT="0" distB="0" distL="114300" distR="114300" simplePos="0" relativeHeight="251710464" behindDoc="0" locked="0" layoutInCell="1" allowOverlap="1" wp14:anchorId="10A62649" wp14:editId="29A477D2">
+            <wp:simplePos x="0" y="0"/>
+            <wp:positionH relativeFrom="column">
+              <wp:posOffset>-424180</wp:posOffset>
+            </wp:positionH>
+            <wp:positionV relativeFrom="paragraph">
+              <wp:posOffset>298450</wp:posOffset>
+            </wp:positionV>
+            <wp:extent cx="3381375" cy="3381375"/>
+            <wp:effectExtent l="0" t="0" r="0" b="0"/>
+            <wp:wrapSquare wrapText="bothSides"/>
+            <wp:docPr id="570140829" name="Obrázek 2"/>
+            <wp:cNvGraphicFramePr>
+              <a:graphicFrameLocks xmlns:a="http://schemas.openxmlformats.org/drawingml/2006/main" noChangeAspect="1"/>
+            </wp:cNvGraphicFramePr>
+            <a:graphic xmlns:a="http://schemas.openxmlformats.org/drawingml/2006/main">
+              <a:graphicData uri="http://schemas.openxmlformats.org/drawingml/2006/picture">
+                <pic:pic xmlns:pic="http://schemas.openxmlformats.org/drawingml/2006/picture">
+                  <pic:nvPicPr>
+                    <pic:cNvPr id="0" name="Picture 1"/>
+                    <pic:cNvPicPr>
+                      <a:picLocks noChangeAspect="1" noChangeArrowheads="1"/>
+                    </pic:cNvPicPr>
+                  </pic:nvPicPr>
+                  <pic:blipFill>
+                    <a:blip r:embed="rId56" cstate="print">
+                      <a:extLst>
+                        <a:ext uri="{28A0092B-C50C-407E-A947-70E740481C1C}">
+                          <a14:useLocalDpi xmlns:a14="http://schemas.microsoft.com/office/drawing/2010/main" val="0"/>
+                        </a:ext>
+                      </a:extLst>
+                    </a:blip>
+                    <a:srcRect/>
+                    <a:stretch>
+                      <a:fillRect/>
+                    </a:stretch>
+                  </pic:blipFill>
+                  <pic:spPr bwMode="auto">
+                    <a:xfrm>
+                      <a:off x="0" y="0"/>
+                      <a:ext cx="3381375" cy="3381375"/>
+                    </a:xfrm>
+                    <a:prstGeom prst="rect">
+                      <a:avLst/>
+                    </a:prstGeom>
+                    <a:noFill/>
+                    <a:ln>
+                      <a:noFill/>
+                    </a:ln>
+                  </pic:spPr>
+                </pic:pic>
+              </a:graphicData>
+            </a:graphic>
+            <wp14:sizeRelH relativeFrom="margin">
+              <wp14:pctWidth>0</wp14:pctWidth>
+            </wp14:sizeRelH>
+            <wp14:sizeRelV relativeFrom="margin">
+              <wp14:pctHeight>0</wp14:pctHeight>
+            </wp14:sizeRelV>
+          </wp:anchor>
+        </w:drawing>
+      </w:r>
+      <w:proofErr w:type="spellStart"/>
+      <w:proofErr w:type="gramStart"/>
+      <w:r>
+        <w:t>Points</w:t>
+      </w:r>
+      <w:proofErr w:type="spellEnd"/>
+      <w:r>
+        <w:t xml:space="preserve"> :</w:t>
+      </w:r>
+      <w:proofErr w:type="gramEnd"/>
+      <w:r>
+        <w:t xml:space="preserve"> 13 </w:t>
+      </w:r>
+    </w:p>
+    <w:p>
+      <w:pPr>
+        <w:pStyle w:val="Nadpis3"/>
+      </w:pPr>
+      <w:r>
+        <w:t>Guardian</w:t>
+      </w:r>
+    </w:p>
+    <w:p>
+      <w:r>
+        <w:rPr>
+          <w:rFonts w:eastAsiaTheme="majorEastAsia" w:cstheme="majorBidi"/>
+          <w:noProof/>
+          <w:color w:val="0F4761" w:themeColor="accent1" w:themeShade="BF"/>
+          <w:sz w:val="28"/>
+          <w:szCs w:val="28"/>
+        </w:rPr>
+        <w:drawing>
+          <wp:anchor distT="0" distB="0" distL="114300" distR="114300" simplePos="0" relativeHeight="251711488" behindDoc="0" locked="0" layoutInCell="1" allowOverlap="1" wp14:anchorId="5F4DBE4E" wp14:editId="754E6C63">
+            <wp:simplePos x="0" y="0"/>
+            <wp:positionH relativeFrom="margin">
+              <wp:posOffset>2776855</wp:posOffset>
+            </wp:positionH>
+            <wp:positionV relativeFrom="paragraph">
+              <wp:posOffset>251460</wp:posOffset>
+            </wp:positionV>
+            <wp:extent cx="3257550" cy="3257550"/>
+            <wp:effectExtent l="0" t="0" r="0" b="0"/>
+            <wp:wrapSquare wrapText="bothSides"/>
+            <wp:docPr id="372066784" name="Obrázek 3"/>
+            <wp:cNvGraphicFramePr>
+              <a:graphicFrameLocks xmlns:a="http://schemas.openxmlformats.org/drawingml/2006/main" noChangeAspect="1"/>
+            </wp:cNvGraphicFramePr>
+            <a:graphic xmlns:a="http://schemas.openxmlformats.org/drawingml/2006/main">
+              <a:graphicData uri="http://schemas.openxmlformats.org/drawingml/2006/picture">
+                <pic:pic xmlns:pic="http://schemas.openxmlformats.org/drawingml/2006/picture">
+                  <pic:nvPicPr>
+                    <pic:cNvPr id="0" name="Picture 2"/>
+                    <pic:cNvPicPr>
+                      <a:picLocks noChangeAspect="1" noChangeArrowheads="1"/>
+                    </pic:cNvPicPr>
+                  </pic:nvPicPr>
+                  <pic:blipFill>
+                    <a:blip r:embed="rId57" cstate="print">
+                      <a:extLst>
+                        <a:ext uri="{28A0092B-C50C-407E-A947-70E740481C1C}">
+                          <a14:useLocalDpi xmlns:a14="http://schemas.microsoft.com/office/drawing/2010/main" val="0"/>
+                        </a:ext>
+                      </a:extLst>
+                    </a:blip>
+                    <a:srcRect/>
+                    <a:stretch>
+                      <a:fillRect/>
+                    </a:stretch>
+                  </pic:blipFill>
+                  <pic:spPr bwMode="auto">
+                    <a:xfrm>
+                      <a:off x="0" y="0"/>
+                      <a:ext cx="3257550" cy="3257550"/>
+                    </a:xfrm>
+                    <a:prstGeom prst="rect">
+                      <a:avLst/>
+                    </a:prstGeom>
+                    <a:noFill/>
+                    <a:ln>
+                      <a:noFill/>
+                    </a:ln>
+                  </pic:spPr>
+                </pic:pic>
+              </a:graphicData>
+            </a:graphic>
+            <wp14:sizeRelH relativeFrom="margin">
+              <wp14:pctWidth>0</wp14:pctWidth>
+            </wp14:sizeRelH>
+            <wp14:sizeRelV relativeFrom="margin">
+              <wp14:pctHeight>0</wp14:pctHeight>
+            </wp14:sizeRelV>
+          </wp:anchor>
+        </w:drawing>
+      </w:r>
+      <w:proofErr w:type="spellStart"/>
+      <w:proofErr w:type="gramStart"/>
+      <w:r>
+        <w:t>Points</w:t>
+      </w:r>
+      <w:proofErr w:type="spellEnd"/>
+      <w:r>
+        <w:t xml:space="preserve"> :</w:t>
+      </w:r>
+      <w:proofErr w:type="gramEnd"/>
+      <w:r>
+        <w:t xml:space="preserve"> 4</w:t>
+      </w:r>
+    </w:p>
+    <w:p>
+      <w:r>
+        <w:br w:type="page"/>
+      </w:r>
+    </w:p>
+    <w:p>
+      <w:pPr>
+        <w:pStyle w:val="Nadpis3"/>
+      </w:pPr>
+      <w:r>
+        <w:lastRenderedPageBreak/>
+        <w:t xml:space="preserve">Hobby </w:t>
+      </w:r>
+      <w:proofErr w:type="spellStart"/>
+      <w:r>
+        <w:t>Horse</w:t>
+      </w:r>
+      <w:proofErr w:type="spellEnd"/>
+    </w:p>
+    <w:p>
+      <w:r>
+        <w:rPr>
+          <w:noProof/>
+        </w:rPr>
+        <w:drawing>
+          <wp:anchor distT="0" distB="0" distL="114300" distR="114300" simplePos="0" relativeHeight="251712512" behindDoc="0" locked="0" layoutInCell="1" allowOverlap="1" wp14:anchorId="1015F2E1" wp14:editId="3149BFC3">
+            <wp:simplePos x="0" y="0"/>
+            <wp:positionH relativeFrom="margin">
+              <wp:posOffset>-833120</wp:posOffset>
+            </wp:positionH>
+            <wp:positionV relativeFrom="paragraph">
+              <wp:posOffset>207645</wp:posOffset>
+            </wp:positionV>
+            <wp:extent cx="3667125" cy="3667125"/>
+            <wp:effectExtent l="0" t="0" r="0" b="0"/>
+            <wp:wrapSquare wrapText="bothSides"/>
+            <wp:docPr id="859946484" name="Obrázek 4"/>
+            <wp:cNvGraphicFramePr>
+              <a:graphicFrameLocks xmlns:a="http://schemas.openxmlformats.org/drawingml/2006/main" noChangeAspect="1"/>
+            </wp:cNvGraphicFramePr>
+            <a:graphic xmlns:a="http://schemas.openxmlformats.org/drawingml/2006/main">
+              <a:graphicData uri="http://schemas.openxmlformats.org/drawingml/2006/picture">
+                <pic:pic xmlns:pic="http://schemas.openxmlformats.org/drawingml/2006/picture">
+                  <pic:nvPicPr>
+                    <pic:cNvPr id="0" name="Picture 3"/>
+                    <pic:cNvPicPr>
+                      <a:picLocks noChangeAspect="1" noChangeArrowheads="1"/>
+                    </pic:cNvPicPr>
+                  </pic:nvPicPr>
+                  <pic:blipFill>
+                    <a:blip r:embed="rId58" cstate="print">
+                      <a:extLst>
+                        <a:ext uri="{28A0092B-C50C-407E-A947-70E740481C1C}">
+                          <a14:useLocalDpi xmlns:a14="http://schemas.microsoft.com/office/drawing/2010/main" val="0"/>
+                        </a:ext>
+                      </a:extLst>
+                    </a:blip>
+                    <a:srcRect/>
+                    <a:stretch>
+                      <a:fillRect/>
+                    </a:stretch>
+                  </pic:blipFill>
+                  <pic:spPr bwMode="auto">
+                    <a:xfrm>
+                      <a:off x="0" y="0"/>
+                      <a:ext cx="3667125" cy="3667125"/>
+                    </a:xfrm>
+                    <a:prstGeom prst="rect">
+                      <a:avLst/>
+                    </a:prstGeom>
+                    <a:noFill/>
+                    <a:ln>
+                      <a:noFill/>
+                    </a:ln>
+                  </pic:spPr>
+                </pic:pic>
+              </a:graphicData>
+            </a:graphic>
+            <wp14:sizeRelH relativeFrom="margin">
+              <wp14:pctWidth>0</wp14:pctWidth>
+            </wp14:sizeRelH>
+            <wp14:sizeRelV relativeFrom="margin">
+              <wp14:pctHeight>0</wp14:pctHeight>
+            </wp14:sizeRelV>
+          </wp:anchor>
+        </w:drawing>
+      </w:r>
+      <w:proofErr w:type="spellStart"/>
+      <w:proofErr w:type="gramStart"/>
+      <w:r>
+        <w:t>Points</w:t>
+      </w:r>
+      <w:proofErr w:type="spellEnd"/>
+      <w:r>
+        <w:t xml:space="preserve"> :</w:t>
+      </w:r>
+      <w:proofErr w:type="gramEnd"/>
+      <w:r>
+        <w:t xml:space="preserve"> 3</w:t>
+      </w:r>
+    </w:p>
+    <w:p>
+      <w:pPr>
+        <w:pStyle w:val="Nadpis3"/>
+      </w:pPr>
+      <w:proofErr w:type="spellStart"/>
+      <w:r>
+        <w:t>Hexa</w:t>
+      </w:r>
+      <w:proofErr w:type="spellEnd"/>
+      <w:r>
+        <w:t xml:space="preserve"> </w:t>
+      </w:r>
+      <w:proofErr w:type="spellStart"/>
+      <w:r>
+        <w:t>Rook</w:t>
+      </w:r>
+      <w:proofErr w:type="spellEnd"/>
+    </w:p>
+    <w:p>
+      <w:r>
+        <w:rPr>
+          <w:noProof/>
+        </w:rPr>
+        <w:drawing>
+          <wp:anchor distT="0" distB="0" distL="114300" distR="114300" simplePos="0" relativeHeight="251713536" behindDoc="0" locked="0" layoutInCell="1" allowOverlap="1" wp14:anchorId="78DC573D" wp14:editId="63BBA8DB">
+            <wp:simplePos x="0" y="0"/>
+            <wp:positionH relativeFrom="column">
+              <wp:posOffset>2681605</wp:posOffset>
+            </wp:positionH>
+            <wp:positionV relativeFrom="paragraph">
+              <wp:posOffset>264795</wp:posOffset>
+            </wp:positionV>
+            <wp:extent cx="3629025" cy="3629025"/>
+            <wp:effectExtent l="0" t="0" r="0" b="0"/>
+            <wp:wrapSquare wrapText="bothSides"/>
+            <wp:docPr id="1057429084" name="Obrázek 5"/>
+            <wp:cNvGraphicFramePr>
+              <a:graphicFrameLocks xmlns:a="http://schemas.openxmlformats.org/drawingml/2006/main" noChangeAspect="1"/>
+            </wp:cNvGraphicFramePr>
+            <a:graphic xmlns:a="http://schemas.openxmlformats.org/drawingml/2006/main">
+              <a:graphicData uri="http://schemas.openxmlformats.org/drawingml/2006/picture">
+                <pic:pic xmlns:pic="http://schemas.openxmlformats.org/drawingml/2006/picture">
+                  <pic:nvPicPr>
+                    <pic:cNvPr id="0" name="Picture 4"/>
+                    <pic:cNvPicPr>
+                      <a:picLocks noChangeAspect="1" noChangeArrowheads="1"/>
+                    </pic:cNvPicPr>
+                  </pic:nvPicPr>
+                  <pic:blipFill>
+                    <a:blip r:embed="rId59" cstate="print">
+                      <a:extLst>
+                        <a:ext uri="{28A0092B-C50C-407E-A947-70E740481C1C}">
+                          <a14:useLocalDpi xmlns:a14="http://schemas.microsoft.com/office/drawing/2010/main" val="0"/>
+                        </a:ext>
+                      </a:extLst>
+                    </a:blip>
+                    <a:srcRect/>
+                    <a:stretch>
+                      <a:fillRect/>
+                    </a:stretch>
+                  </pic:blipFill>
+                  <pic:spPr bwMode="auto">
+                    <a:xfrm>
+                      <a:off x="0" y="0"/>
+                      <a:ext cx="3629025" cy="3629025"/>
+                    </a:xfrm>
+                    <a:prstGeom prst="rect">
+                      <a:avLst/>
+                    </a:prstGeom>
+                    <a:noFill/>
+                    <a:ln>
+                      <a:noFill/>
+                    </a:ln>
+                  </pic:spPr>
+                </pic:pic>
+              </a:graphicData>
+            </a:graphic>
+            <wp14:sizeRelH relativeFrom="margin">
+              <wp14:pctWidth>0</wp14:pctWidth>
+            </wp14:sizeRelH>
+            <wp14:sizeRelV relativeFrom="margin">
+              <wp14:pctHeight>0</wp14:pctHeight>
+            </wp14:sizeRelV>
+          </wp:anchor>
+        </w:drawing>
+      </w:r>
+      <w:proofErr w:type="spellStart"/>
+      <w:proofErr w:type="gramStart"/>
+      <w:r>
+        <w:t>Points</w:t>
+      </w:r>
+      <w:proofErr w:type="spellEnd"/>
+      <w:r>
+        <w:t xml:space="preserve"> :</w:t>
+      </w:r>
+      <w:proofErr w:type="gramEnd"/>
+      <w:r>
+        <w:t xml:space="preserve"> </w:t>
+      </w:r>
+      <w:r>
+        <w:t>8</w:t>
+      </w:r>
+    </w:p>
     <w:p/>
     <w:p>
       <w:r>
@@ -6485,10 +7024,10 @@
                     <pic:cNvPicPr/>
                   </pic:nvPicPr>
                   <pic:blipFill>
-                    <a:blip r:embed="rId53">
+                    <a:blip r:embed="rId60">
                       <a:extLst>
                         <a:ext uri="{96DAC541-7B7A-43D3-8B79-37D633B846F1}">
-                          <asvg:svgBlip xmlns:asvg="http://schemas.microsoft.com/office/drawing/2016/SVG/main" r:embed="rId54"/>
+                          <asvg:svgBlip xmlns:asvg="http://schemas.microsoft.com/office/drawing/2016/SVG/main" r:embed="rId61"/>
                         </a:ext>
                       </a:extLst>
                     </a:blip>

</xml_diff>